<commit_message>
Drop proposed TACoS figures and event dates from DBS4 corrections
Co-Authored-By: Claude Opus 5.5 <noreply@anthropic.com>
Claude-Session: https://claude.ai/code/session_01LY7A1KPDoE1cQtWdmceR2R
</commit_message>
<xml_diff>
--- a/docs/DBS4_Audit_Corrections_20260928.docx
+++ b/docs/DBS4_Audit_Corrections_20260928.docx
@@ -79,7 +79,7 @@
         <w:t xml:space="preserve">Set goals for the run. </w:t>
       </w:r>
       <w:r>
-        <w:t xml:space="preserve">The audit has no spend target, no TACoS goal and no product goal, only a forecast. We set: TACoS 12%, never above 14%, and a spend limit that grows with sales. The product goal is to build rank on the focus terms steadily into the October Prime event and Black Friday / Cyber Monday (Section 3).</w:t>
+        <w:t xml:space="preserve">The audit has no spend target, no TACoS goal and no product goal, only a forecast. The run needs all three: a TACoS goal below the pre-deal level, a spend limit tied to sales, and a product goal to build rank on the focus terms steadily into Prime and Black Friday / Cyber Monday (Section 3).</w:t>
       </w:r>
     </w:p>
     <w:p>
@@ -215,7 +215,7 @@
         <w:t xml:space="preserve">Decisions needed from you by 30 September: </w:t>
       </w:r>
       <w:r>
-        <w:t xml:space="preserve">the goals (Section 3); whether “bamboo sheets” joins the push (Section 5.4); which product owns each term B4 and B6 share (Section 11); and the dates of the October Prime event and B4’s late-October deal (Section 4).</w:t>
+        <w:t xml:space="preserve">the goals (Section 3); whether “bamboo sheets” joins the push (Section 5.4); and which product owns each term B4 and B6 share (Section 11).</w:t>
       </w:r>
     </w:p>
     <w:p>
@@ -1900,7 +1900,7 @@
         <w:t xml:space="preserve">Rank is built before a sales event, not only during it. </w:t>
       </w:r>
       <w:r>
-        <w:t xml:space="preserve">Focus terms are pushed at top of search continuously into each event (the October Prime event, B4’s late-October deal, Black Friday / Cyber Monday). Each term needs four things for a push: shoppers click our ad more than the market average, clicks convert better than the market average, stock can hold the position, and the campaign is actually serving. A term missing any of them runs at break-even until it’s fixed.</w:t>
+        <w:t xml:space="preserve">Focus terms are pushed at top of search continuously into each event (Prime, Black Friday / Cyber Monday). Each term needs four things for a push: shoppers click our ad more than the market average, clicks convert better than the market average, stock can hold the position, and the campaign is actually serving. A term missing any of them runs at break-even until it’s fixed.</w:t>
       </w:r>
     </w:p>
     <w:p>
@@ -2129,10 +2129,10 @@
           <w:b/>
           <w:bCs/>
         </w:rPr>
-        <w:t xml:space="preserve">TACoS goal: 12%, never above 14%. </w:t>
-      </w:r>
-      <w:r>
-        <w:t xml:space="preserve">Hold the pre-deal level at most and bring it down as organic rank grows. The push is paid for by cutting waste, not by adding spend on top (Section 5.5).</w:t>
+        <w:t xml:space="preserve">TACoS goal: below the pre-deal level. </w:t>
+      </w:r>
+      <w:r>
+        <w:t xml:space="preserve">Set it under the 14.1% B4 ran at before the deal, and bring it down further as organic rank grows. The push is paid for by cutting waste, not by adding spend on top (Section 5.5).</w:t>
       </w:r>
     </w:p>
     <w:p>
@@ -2149,10 +2149,10 @@
           <w:b/>
           <w:bCs/>
         </w:rPr>
-        <w:t xml:space="preserve">Spend limit: 14% of the last 7 days’ total sales. </w:t>
-      </w:r>
-      <w:r>
-        <w:t xml:space="preserve">At the pre-deal level (about $4,650 a day in total sales) that is about $650 a day, with about $560 as the target at 12%. The limit rises as sales rise, so rank gains fund a bigger push. Within the limit, the focus terms’ top-of-search push is funded first.</w:t>
+        <w:t xml:space="preserve">Spend limit: a share of the last 7 days’ total sales, </w:t>
+      </w:r>
+      <w:r>
+        <w:t xml:space="preserve">set from the TACoS goal. The limit rises as sales rise, so rank gains fund a bigger push. Within the limit, the focus terms’ top-of-search push is funded first.</w:t>
       </w:r>
     </w:p>
     <w:p>
@@ -2172,7 +2172,7 @@
         <w:t xml:space="preserve">Product goal: </w:t>
       </w:r>
       <w:r>
-        <w:t xml:space="preserve">enter the October Prime event and Black Friday with the focus terms as high as possible, and keep the gains afterwards. Milestones:</w:t>
+        <w:t xml:space="preserve">enter Prime and Black Friday with the focus terms as high as possible, and keep the gains afterwards. Milestones:</w:t>
       </w:r>
     </w:p>
     <w:p>
@@ -2232,7 +2232,7 @@
         <w:spacing w:after="100"/>
       </w:pPr>
       <w:r>
-        <w:t xml:space="preserve">Check every Monday. If TACoS runs over 14%, cut first whatever is still above break-even outside the push. If it runs under 12% and rank is climbing, raise the push budget.</w:t>
+        <w:t xml:space="preserve">Check every Monday. If TACoS runs over the goal, cut first whatever is still above break-even outside the push. If it runs under the goal and rank is climbing, raise the push budget.</w:t>
       </w:r>
     </w:p>
     <w:p>
@@ -2289,7 +2289,7 @@
         <w:t xml:space="preserve">Bring spend back inside the limit. </w:t>
       </w:r>
       <w:r>
-        <w:t xml:space="preserve">Spend is $1,142 a day; the limit is about $650. The cut comes from what doesn’t build rank: out-of-focus ranking campaigns come to break-even (straight away with no top-of-search clicks, in 50% steps with them), product-page leaks are fixed (Section 9), and ranking terms are excluded from broad, auto and clearance campaigns (Section 11). Conversions campaigns over break-even step down too (Section 12).</w:t>
+        <w:t xml:space="preserve">Spend is $1,142 a day, far above the pre-deal $656. The cut comes from what doesn’t build rank: out-of-focus ranking campaigns come to break-even (straight away with no top-of-search clicks, in 50% steps with them), product-page leaks are fixed (Section 9), and ranking terms are excluded from broad, auto and clearance campaigns (Section 11). Conversions campaigns over break-even step down too (Section 12).</w:t>
       </w:r>
     </w:p>
     <w:p>
@@ -2474,10 +2474,10 @@
           <w:b/>
           <w:bCs/>
         </w:rPr>
-        <w:t xml:space="preserve">October Prime event and B4’s late-October deal: </w:t>
-      </w:r>
-      <w:r>
-        <w:t xml:space="preserve">confirm both dates this week. By 20 October, size each event’s push per focus term (price, clicks, budget, owner) and check stock covers it. After each event, repeat Day 1 and Week 1: back to the limit, and no judging on event data.</w:t>
+        <w:t xml:space="preserve">Prime: </w:t>
+      </w:r>
+      <w:r>
+        <w:t xml:space="preserve">at least three weeks before the event, size its push per focus term (price, clicks, budget, owner) and check stock covers it. After each event, repeat Day 1 and Week 1: back to the limit, and no judging on event data.</w:t>
       </w:r>
     </w:p>
     <w:p>
@@ -3898,7 +3898,7 @@
         <w:spacing w:after="100"/>
       </w:pPr>
       <w:r>
-        <w:t xml:space="preserve">Each Monday, spend is checked against the 14% limit (Section 3).</w:t>
+        <w:t xml:space="preserve">Each Monday, spend is checked against the limit (Section 3).</w:t>
       </w:r>
     </w:p>
     <w:p>
@@ -8228,7 +8228,7 @@
         <w:spacing w:after="60"/>
       </w:pPr>
       <w:r>
-        <w:t xml:space="preserve">By 30 September: agree the goals, decide on “bamboo sheets”, name owners for the B4/B6 shared terms, and confirm the October Prime event and late-October deal dates.</w:t>
+        <w:t xml:space="preserve">By 30 September: agree the goals, decide on “bamboo sheets”, and name owners for the B4/B6 shared terms.</w:t>
       </w:r>
     </w:p>
     <w:p>
@@ -8280,7 +8280,7 @@
         <w:spacing w:after="60"/>
       </w:pPr>
       <w:r>
-        <w:t xml:space="preserve">Every Monday: TACoS against 12% (limit 14%) and spend against 14% of the last 7 days’ sales.</w:t>
+        <w:t xml:space="preserve">Every Monday: TACoS against its goal and spend against the limit.</w:t>
       </w:r>
     </w:p>
     <w:p>
@@ -8306,7 +8306,7 @@
         <w:spacing w:after="60"/>
       </w:pPr>
       <w:r>
-        <w:t xml:space="preserve">By 20 October: each event’s push sized, owned, funded and stock-checked. Switch ads back to White as stock lands (16 and 27 October). Run the push into Black Friday / Cyber Monday from early November.</w:t>
+        <w:t xml:space="preserve">At least three weeks before each event: its push sized, owned, funded and stock-checked. Switch ads back to White as stock lands (16 and 27 October). Run the push into Black Friday / Cyber Monday from early November.</w:t>
       </w:r>
     </w:p>
     <w:p>

</xml_diff>

<commit_message>
Remove B4/B6 term overlap from DBS4 corrections
Co-Authored-By: Claude Opus 5.5 <noreply@anthropic.com>
Claude-Session: https://claude.ai/code/session_01LY7A1KPDoE1cQtWdmceR2R
</commit_message>
<xml_diff>
--- a/docs/DBS4_Audit_Corrections_20260928.docx
+++ b/docs/DBS4_Audit_Corrections_20260928.docx
@@ -179,7 +179,7 @@
         <w:t xml:space="preserve">Stop our campaigns competing with each other. </w:t>
       </w:r>
       <w:r>
-        <w:t xml:space="preserve">A clearance campaign took 164 clicks on “bamboo sheets” in 30 days. B4 and B6 both bid on 87 of the same ranking terms with no owner named (Section 11).</w:t>
+        <w:t xml:space="preserve">A clearance campaign took 164 clicks on “bamboo sheets” in 30 days. 26 ranking terms are also bought by broad or auto campaigns (Section 11).</w:t>
       </w:r>
     </w:p>
     <w:p>
@@ -215,7 +215,7 @@
         <w:t xml:space="preserve">Decisions needed from you by 30 September: </w:t>
       </w:r>
       <w:r>
-        <w:t xml:space="preserve">the goals (Section 3); whether “bamboo sheets” joins the push (Section 5.4); and which product owns each term B4 and B6 share (Section 11).</w:t>
+        <w:t xml:space="preserve">the goals (Section 3) and whether “bamboo sheets” joins the push (Section 5.4).</w:t>
       </w:r>
     </w:p>
     <w:p>
@@ -697,56 +697,6 @@
                 <w:szCs w:val="17"/>
               </w:rPr>
               <w:t xml:space="preserve">Ranking campaigns advertise White (or the size’s next-best seller while White is short). Auto, broad and phrase campaigns advertise a slow-selling colour with a lot of stock.</w:t>
-            </w:r>
-          </w:p>
-        </w:tc>
-      </w:tr>
-      <w:tr>
-        <w:tc>
-          <w:tcPr>
-            <w:tcW w:type="dxa" w:w="2600"/>
-            <w:shd w:fill="FFFFFF" w:color="auto" w:val="clear"/>
-            <w:tcMar>
-              <w:top w:type="dxa" w:w="40"/>
-              <w:left w:type="dxa" w:w="70"/>
-              <w:bottom w:type="dxa" w:w="40"/>
-              <w:right w:type="dxa" w:w="70"/>
-            </w:tcMar>
-          </w:tcPr>
-          <w:p>
-            <w:pPr>
-              <w:spacing w:after="0"/>
-            </w:pPr>
-            <w:r>
-              <w:rPr>
-                <w:sz w:val="17"/>
-                <w:szCs w:val="17"/>
-              </w:rPr>
-              <w:t xml:space="preserve">B4 / B6</w:t>
-            </w:r>
-          </w:p>
-        </w:tc>
-        <w:tc>
-          <w:tcPr>
-            <w:tcW w:type="dxa" w:w="7372"/>
-            <w:shd w:fill="FFFFFF" w:color="auto" w:val="clear"/>
-            <w:tcMar>
-              <w:top w:type="dxa" w:w="40"/>
-              <w:left w:type="dxa" w:w="70"/>
-              <w:bottom w:type="dxa" w:w="40"/>
-              <w:right w:type="dxa" w:w="70"/>
-            </w:tcMar>
-          </w:tcPr>
-          <w:p>
-            <w:pPr>
-              <w:spacing w:after="0"/>
-            </w:pPr>
-            <w:r>
-              <w:rPr>
-                <w:sz w:val="17"/>
-                <w:szCs w:val="17"/>
-              </w:rPr>
-              <w:t xml:space="preserve">B4 is this product (4-piece). B6 is the 6-piece, which bids on many of the same terms.</w:t>
             </w:r>
           </w:p>
         </w:tc>
@@ -2020,7 +1970,7 @@
         <w:t xml:space="preserve">One owner per search term. </w:t>
       </w:r>
       <w:r>
-        <w:t xml:space="preserve">Each ranking term is bought by one exact campaign; broad, auto and phrase campaigns exclude it. When B4 and B6 bid the same term, one product owns it. The other stays at break-even and never bids against the owner.</w:t>
+        <w:t xml:space="preserve">Each ranking term is bought by one exact campaign; broad, auto and phrase campaigns exclude it.</w:t>
       </w:r>
     </w:p>
     <w:p>
@@ -3809,7 +3759,7 @@
         <w:t xml:space="preserve">Your decision. </w:t>
       </w:r>
       <w:r>
-        <w:t xml:space="preserve">Whether “bamboo sheets” is a push term into the events. That needs B4 named as its owner over B6, its market price, and a budget of about 23 top-of-search clicks a day. If it isn’t a push term, its price steps down to the $2.26 break-even the following week.</w:t>
+        <w:t xml:space="preserve">Whether “bamboo sheets” is a push term into the events. That needs its market price and a budget of about 23 top-of-search clicks a day. If it isn’t a push term, its price steps down to the $2.26 break-even the following week.</w:t>
       </w:r>
     </w:p>
     <w:p>
@@ -3865,19 +3815,6 @@
       </w:pPr>
       <w:r>
         <w:t xml:space="preserve">The clearance broad campaign buying “bamboo sheets” ($409 in 30 days).</w:t>
-      </w:r>
-    </w:p>
-    <w:p>
-      <w:pPr>
-        <w:pStyle w:val="ListParagraph"/>
-        <w:numPr>
-          <w:ilvl w:val="0"/>
-          <w:numId w:val="4"/>
-        </w:numPr>
-        <w:spacing w:after="60"/>
-      </w:pPr>
-      <w:r>
-        <w:t xml:space="preserve">B4 and B6 bidding against each other (Section 11).</w:t>
       </w:r>
     </w:p>
     <w:p>
@@ -4549,7 +4486,7 @@
         <w:spacing w:after="100"/>
       </w:pPr>
       <w:r>
-        <w:t xml:space="preserve">Before the push price goes live: exclude “bamboo sheets king” from the clearance broad campaign (10 of its 50 clicks went there) and from the main broad campaign. Also name B4 as the owner over B6 on both terms (Section 11).</w:t>
+        <w:t xml:space="preserve">Before the push price goes live: exclude “bamboo sheets king” from the clearance broad campaign (10 of its 50 clicks went there) and from the main broad campaign.</w:t>
       </w:r>
     </w:p>
     <w:p>
@@ -6158,15 +6095,7 @@
         <w:pStyle w:val="Heading1"/>
       </w:pPr>
       <w:r>
-        <w:t xml:space="preserve">11. One owner per search term — within B4, and between B4 and B6</w:t>
-      </w:r>
-    </w:p>
-    <w:p>
-      <w:pPr>
-        <w:pStyle w:val="Heading2"/>
-      </w:pPr>
-      <w:r>
-        <w:t xml:space="preserve">11.1 Broad, auto and clearance campaigns buying ranking terms</w:t>
+        <w:t xml:space="preserve">11. One owner per search term</w:t>
       </w:r>
     </w:p>
     <w:p>
@@ -6191,927 +6120,6 @@
       </w:r>
       <w:r>
         <w:t xml:space="preserve">Exclude every ranking term (negative exact) from the broad, auto and phrase campaigns that buy it, starting with the clearance broad. Keep one exact owner per term: the campaign on the ranking colour with the clicks. Pause the duplicate. Check that the audit’s exclusion changes on the three clearance campaigns add the ranking terms rather than remove them, and send those three to the clearance owner.</w:t>
-      </w:r>
-    </w:p>
-    <w:p>
-      <w:pPr>
-        <w:pStyle w:val="Heading2"/>
-      </w:pPr>
-      <w:r>
-        <w:t xml:space="preserve">11.2 Terms B4 and B6 both bid</w:t>
-      </w:r>
-    </w:p>
-    <w:p>
-      <w:pPr>
-        <w:spacing w:after="100"/>
-      </w:pPr>
-      <w:r>
-        <w:t xml:space="preserve">B4 and B6 both run active exact campaigns on 87 of B4’s ranking terms, and no owner is named for any of them. The audit sets each product’s price as if the other weren’t in the auction, so every push raises the price against ourselves. Suggested owner = whichever took more top-of-search orders on the term in 30 days, as a starting point for your decision:</w:t>
-      </w:r>
-    </w:p>
-    <w:tbl>
-      <w:tblPr>
-        <w:tblW w:type="dxa" w:w="9972"/>
-        <w:tblBorders>
-          <w:top w:val="single" w:color="auto" w:sz="4"/>
-          <w:left w:val="single" w:color="auto" w:sz="4"/>
-          <w:bottom w:val="single" w:color="auto" w:sz="4"/>
-          <w:right w:val="single" w:color="auto" w:sz="4"/>
-          <w:insideH w:val="single" w:color="auto" w:sz="4"/>
-          <w:insideV w:val="single" w:color="auto" w:sz="4"/>
-        </w:tblBorders>
-      </w:tblPr>
-      <w:tblGrid>
-        <w:gridCol w:w="3000"/>
-        <w:gridCol w:w="1200"/>
-        <w:gridCol w:w="2300"/>
-        <w:gridCol w:w="2300"/>
-        <w:gridCol w:w="1172"/>
-      </w:tblGrid>
-      <w:tr>
-        <w:trPr>
-          <w:tblHeader/>
-        </w:trPr>
-        <w:tc>
-          <w:tcPr>
-            <w:tcW w:type="dxa" w:w="3000"/>
-            <w:shd w:fill="1F3A5F" w:color="auto" w:val="clear"/>
-            <w:tcMar>
-              <w:top w:type="dxa" w:w="40"/>
-              <w:left w:type="dxa" w:w="70"/>
-              <w:bottom w:type="dxa" w:w="40"/>
-              <w:right w:type="dxa" w:w="70"/>
-            </w:tcMar>
-          </w:tcPr>
-          <w:p>
-            <w:pPr>
-              <w:spacing w:after="0"/>
-            </w:pPr>
-            <w:r>
-              <w:rPr>
-                <w:b/>
-                <w:bCs/>
-                <w:color w:val="FFFFFF"/>
-                <w:sz w:val="17"/>
-                <w:szCs w:val="17"/>
-              </w:rPr>
-              <w:t xml:space="preserve">Term</w:t>
-            </w:r>
-          </w:p>
-        </w:tc>
-        <w:tc>
-          <w:tcPr>
-            <w:tcW w:type="dxa" w:w="1200"/>
-            <w:shd w:fill="1F3A5F" w:color="auto" w:val="clear"/>
-            <w:tcMar>
-              <w:top w:type="dxa" w:w="40"/>
-              <w:left w:type="dxa" w:w="70"/>
-              <w:bottom w:type="dxa" w:w="40"/>
-              <w:right w:type="dxa" w:w="70"/>
-            </w:tcMar>
-          </w:tcPr>
-          <w:p>
-            <w:pPr>
-              <w:spacing w:after="0"/>
-            </w:pPr>
-            <w:r>
-              <w:rPr>
-                <w:b/>
-                <w:bCs/>
-                <w:color w:val="FFFFFF"/>
-                <w:sz w:val="17"/>
-                <w:szCs w:val="17"/>
-              </w:rPr>
-              <w:t xml:space="preserve">Rank B4 / B6</w:t>
-            </w:r>
-          </w:p>
-        </w:tc>
-        <w:tc>
-          <w:tcPr>
-            <w:tcW w:type="dxa" w:w="2300"/>
-            <w:shd w:fill="1F3A5F" w:color="auto" w:val="clear"/>
-            <w:tcMar>
-              <w:top w:type="dxa" w:w="40"/>
-              <w:left w:type="dxa" w:w="70"/>
-              <w:bottom w:type="dxa" w:w="40"/>
-              <w:right w:type="dxa" w:w="70"/>
-            </w:tcMar>
-          </w:tcPr>
-          <w:p>
-            <w:pPr>
-              <w:spacing w:after="0"/>
-            </w:pPr>
-            <w:r>
-              <w:rPr>
-                <w:b/>
-                <w:bCs/>
-                <w:color w:val="FFFFFF"/>
-                <w:sz w:val="17"/>
-                <w:szCs w:val="17"/>
-              </w:rPr>
-              <w:t xml:space="preserve">B4: spend · top-of-search clicks → orders</w:t>
-            </w:r>
-          </w:p>
-        </w:tc>
-        <w:tc>
-          <w:tcPr>
-            <w:tcW w:type="dxa" w:w="2300"/>
-            <w:shd w:fill="1F3A5F" w:color="auto" w:val="clear"/>
-            <w:tcMar>
-              <w:top w:type="dxa" w:w="40"/>
-              <w:left w:type="dxa" w:w="70"/>
-              <w:bottom w:type="dxa" w:w="40"/>
-              <w:right w:type="dxa" w:w="70"/>
-            </w:tcMar>
-          </w:tcPr>
-          <w:p>
-            <w:pPr>
-              <w:spacing w:after="0"/>
-            </w:pPr>
-            <w:r>
-              <w:rPr>
-                <w:b/>
-                <w:bCs/>
-                <w:color w:val="FFFFFF"/>
-                <w:sz w:val="17"/>
-                <w:szCs w:val="17"/>
-              </w:rPr>
-              <w:t xml:space="preserve">B6: spend · top-of-search clicks → orders</w:t>
-            </w:r>
-          </w:p>
-        </w:tc>
-        <w:tc>
-          <w:tcPr>
-            <w:tcW w:type="dxa" w:w="1172"/>
-            <w:shd w:fill="1F3A5F" w:color="auto" w:val="clear"/>
-            <w:tcMar>
-              <w:top w:type="dxa" w:w="40"/>
-              <w:left w:type="dxa" w:w="70"/>
-              <w:bottom w:type="dxa" w:w="40"/>
-              <w:right w:type="dxa" w:w="70"/>
-            </w:tcMar>
-          </w:tcPr>
-          <w:p>
-            <w:pPr>
-              <w:spacing w:after="0"/>
-            </w:pPr>
-            <w:r>
-              <w:rPr>
-                <w:b/>
-                <w:bCs/>
-                <w:color w:val="FFFFFF"/>
-                <w:sz w:val="17"/>
-                <w:szCs w:val="17"/>
-              </w:rPr>
-              <w:t xml:space="preserve">Suggested owner</w:t>
-            </w:r>
-          </w:p>
-        </w:tc>
-      </w:tr>
-      <w:tr>
-        <w:tc>
-          <w:tcPr>
-            <w:tcW w:type="dxa" w:w="3000"/>
-            <w:shd w:fill="FFFFFF" w:color="auto" w:val="clear"/>
-            <w:tcMar>
-              <w:top w:type="dxa" w:w="40"/>
-              <w:left w:type="dxa" w:w="70"/>
-              <w:bottom w:type="dxa" w:w="40"/>
-              <w:right w:type="dxa" w:w="70"/>
-            </w:tcMar>
-          </w:tcPr>
-          <w:p>
-            <w:pPr>
-              <w:spacing w:after="0"/>
-            </w:pPr>
-            <w:r>
-              <w:rPr>
-                <w:sz w:val="17"/>
-                <w:szCs w:val="17"/>
-              </w:rPr>
-              <w:t xml:space="preserve">bamboo sheets</w:t>
-            </w:r>
-          </w:p>
-        </w:tc>
-        <w:tc>
-          <w:tcPr>
-            <w:tcW w:type="dxa" w:w="1200"/>
-            <w:shd w:fill="FFFFFF" w:color="auto" w:val="clear"/>
-            <w:tcMar>
-              <w:top w:type="dxa" w:w="40"/>
-              <w:left w:type="dxa" w:w="70"/>
-              <w:bottom w:type="dxa" w:w="40"/>
-              <w:right w:type="dxa" w:w="70"/>
-            </w:tcMar>
-          </w:tcPr>
-          <w:p>
-            <w:pPr>
-              <w:spacing w:after="0"/>
-            </w:pPr>
-            <w:r>
-              <w:rPr>
-                <w:sz w:val="17"/>
-                <w:szCs w:val="17"/>
-              </w:rPr>
-              <w:t xml:space="preserve">30 / 34</w:t>
-            </w:r>
-          </w:p>
-        </w:tc>
-        <w:tc>
-          <w:tcPr>
-            <w:tcW w:type="dxa" w:w="2300"/>
-            <w:shd w:fill="FFFFFF" w:color="auto" w:val="clear"/>
-            <w:tcMar>
-              <w:top w:type="dxa" w:w="40"/>
-              <w:left w:type="dxa" w:w="70"/>
-              <w:bottom w:type="dxa" w:w="40"/>
-              <w:right w:type="dxa" w:w="70"/>
-            </w:tcMar>
-          </w:tcPr>
-          <w:p>
-            <w:pPr>
-              <w:spacing w:after="0"/>
-            </w:pPr>
-            <w:r>
-              <w:rPr>
-                <w:sz w:val="17"/>
-                <w:szCs w:val="17"/>
-              </w:rPr>
-              <w:t xml:space="preserve">$7,164 · 1,042 → 119</w:t>
-            </w:r>
-          </w:p>
-        </w:tc>
-        <w:tc>
-          <w:tcPr>
-            <w:tcW w:type="dxa" w:w="2300"/>
-            <w:shd w:fill="FFFFFF" w:color="auto" w:val="clear"/>
-            <w:tcMar>
-              <w:top w:type="dxa" w:w="40"/>
-              <w:left w:type="dxa" w:w="70"/>
-              <w:bottom w:type="dxa" w:w="40"/>
-              <w:right w:type="dxa" w:w="70"/>
-            </w:tcMar>
-          </w:tcPr>
-          <w:p>
-            <w:pPr>
-              <w:spacing w:after="0"/>
-            </w:pPr>
-            <w:r>
-              <w:rPr>
-                <w:sz w:val="17"/>
-                <w:szCs w:val="17"/>
-              </w:rPr>
-              <w:t xml:space="preserve">$2,958 · 291 → 55</w:t>
-            </w:r>
-          </w:p>
-        </w:tc>
-        <w:tc>
-          <w:tcPr>
-            <w:tcW w:type="dxa" w:w="1172"/>
-            <w:shd w:fill="FFFFFF" w:color="auto" w:val="clear"/>
-            <w:tcMar>
-              <w:top w:type="dxa" w:w="40"/>
-              <w:left w:type="dxa" w:w="70"/>
-              <w:bottom w:type="dxa" w:w="40"/>
-              <w:right w:type="dxa" w:w="70"/>
-            </w:tcMar>
-          </w:tcPr>
-          <w:p>
-            <w:pPr>
-              <w:spacing w:after="0"/>
-            </w:pPr>
-            <w:r>
-              <w:rPr>
-                <w:sz w:val="17"/>
-                <w:szCs w:val="17"/>
-              </w:rPr>
-              <w:t xml:space="preserve">B4</w:t>
-            </w:r>
-          </w:p>
-        </w:tc>
-      </w:tr>
-      <w:tr>
-        <w:tc>
-          <w:tcPr>
-            <w:tcW w:type="dxa" w:w="3000"/>
-            <w:shd w:fill="F2F5F9" w:color="auto" w:val="clear"/>
-            <w:tcMar>
-              <w:top w:type="dxa" w:w="40"/>
-              <w:left w:type="dxa" w:w="70"/>
-              <w:bottom w:type="dxa" w:w="40"/>
-              <w:right w:type="dxa" w:w="70"/>
-            </w:tcMar>
-          </w:tcPr>
-          <w:p>
-            <w:pPr>
-              <w:spacing w:after="0"/>
-            </w:pPr>
-            <w:r>
-              <w:rPr>
-                <w:sz w:val="17"/>
-                <w:szCs w:val="17"/>
-              </w:rPr>
-              <w:t xml:space="preserve">bamboo sheets queen size</w:t>
-            </w:r>
-          </w:p>
-        </w:tc>
-        <w:tc>
-          <w:tcPr>
-            <w:tcW w:type="dxa" w:w="1200"/>
-            <w:shd w:fill="F2F5F9" w:color="auto" w:val="clear"/>
-            <w:tcMar>
-              <w:top w:type="dxa" w:w="40"/>
-              <w:left w:type="dxa" w:w="70"/>
-              <w:bottom w:type="dxa" w:w="40"/>
-              <w:right w:type="dxa" w:w="70"/>
-            </w:tcMar>
-          </w:tcPr>
-          <w:p>
-            <w:pPr>
-              <w:spacing w:after="0"/>
-            </w:pPr>
-            <w:r>
-              <w:rPr>
-                <w:sz w:val="17"/>
-                <w:szCs w:val="17"/>
-              </w:rPr>
-              <w:t xml:space="preserve">45 / 25</w:t>
-            </w:r>
-          </w:p>
-        </w:tc>
-        <w:tc>
-          <w:tcPr>
-            <w:tcW w:type="dxa" w:w="2300"/>
-            <w:shd w:fill="F2F5F9" w:color="auto" w:val="clear"/>
-            <w:tcMar>
-              <w:top w:type="dxa" w:w="40"/>
-              <w:left w:type="dxa" w:w="70"/>
-              <w:bottom w:type="dxa" w:w="40"/>
-              <w:right w:type="dxa" w:w="70"/>
-            </w:tcMar>
-          </w:tcPr>
-          <w:p>
-            <w:pPr>
-              <w:spacing w:after="0"/>
-            </w:pPr>
-            <w:r>
-              <w:rPr>
-                <w:sz w:val="17"/>
-                <w:szCs w:val="17"/>
-              </w:rPr>
-              <w:t xml:space="preserve">$1,117 · 101 → 26</w:t>
-            </w:r>
-          </w:p>
-        </w:tc>
-        <w:tc>
-          <w:tcPr>
-            <w:tcW w:type="dxa" w:w="2300"/>
-            <w:shd w:fill="F2F5F9" w:color="auto" w:val="clear"/>
-            <w:tcMar>
-              <w:top w:type="dxa" w:w="40"/>
-              <w:left w:type="dxa" w:w="70"/>
-              <w:bottom w:type="dxa" w:w="40"/>
-              <w:right w:type="dxa" w:w="70"/>
-            </w:tcMar>
-          </w:tcPr>
-          <w:p>
-            <w:pPr>
-              <w:spacing w:after="0"/>
-            </w:pPr>
-            <w:r>
-              <w:rPr>
-                <w:sz w:val="17"/>
-                <w:szCs w:val="17"/>
-              </w:rPr>
-              <w:t xml:space="preserve">$243 · 33 → 8</w:t>
-            </w:r>
-          </w:p>
-        </w:tc>
-        <w:tc>
-          <w:tcPr>
-            <w:tcW w:type="dxa" w:w="1172"/>
-            <w:shd w:fill="F2F5F9" w:color="auto" w:val="clear"/>
-            <w:tcMar>
-              <w:top w:type="dxa" w:w="40"/>
-              <w:left w:type="dxa" w:w="70"/>
-              <w:bottom w:type="dxa" w:w="40"/>
-              <w:right w:type="dxa" w:w="70"/>
-            </w:tcMar>
-          </w:tcPr>
-          <w:p>
-            <w:pPr>
-              <w:spacing w:after="0"/>
-            </w:pPr>
-            <w:r>
-              <w:rPr>
-                <w:sz w:val="17"/>
-                <w:szCs w:val="17"/>
-              </w:rPr>
-              <w:t xml:space="preserve">B4</w:t>
-            </w:r>
-          </w:p>
-        </w:tc>
-      </w:tr>
-      <w:tr>
-        <w:tc>
-          <w:tcPr>
-            <w:tcW w:type="dxa" w:w="3000"/>
-            <w:shd w:fill="FFFFFF" w:color="auto" w:val="clear"/>
-            <w:tcMar>
-              <w:top w:type="dxa" w:w="40"/>
-              <w:left w:type="dxa" w:w="70"/>
-              <w:bottom w:type="dxa" w:w="40"/>
-              <w:right w:type="dxa" w:w="70"/>
-            </w:tcMar>
-          </w:tcPr>
-          <w:p>
-            <w:pPr>
-              <w:spacing w:after="0"/>
-            </w:pPr>
-            <w:r>
-              <w:rPr>
-                <w:sz w:val="17"/>
-                <w:szCs w:val="17"/>
-              </w:rPr>
-              <w:t xml:space="preserve">bamboo cooling sheets</w:t>
-            </w:r>
-          </w:p>
-        </w:tc>
-        <w:tc>
-          <w:tcPr>
-            <w:tcW w:type="dxa" w:w="1200"/>
-            <w:shd w:fill="FFFFFF" w:color="auto" w:val="clear"/>
-            <w:tcMar>
-              <w:top w:type="dxa" w:w="40"/>
-              <w:left w:type="dxa" w:w="70"/>
-              <w:bottom w:type="dxa" w:w="40"/>
-              <w:right w:type="dxa" w:w="70"/>
-            </w:tcMar>
-          </w:tcPr>
-          <w:p>
-            <w:pPr>
-              <w:spacing w:after="0"/>
-            </w:pPr>
-            <w:r>
-              <w:rPr>
-                <w:sz w:val="17"/>
-                <w:szCs w:val="17"/>
-              </w:rPr>
-              <w:t xml:space="preserve">32 / 23</w:t>
-            </w:r>
-          </w:p>
-        </w:tc>
-        <w:tc>
-          <w:tcPr>
-            <w:tcW w:type="dxa" w:w="2300"/>
-            <w:shd w:fill="FFFFFF" w:color="auto" w:val="clear"/>
-            <w:tcMar>
-              <w:top w:type="dxa" w:w="40"/>
-              <w:left w:type="dxa" w:w="70"/>
-              <w:bottom w:type="dxa" w:w="40"/>
-              <w:right w:type="dxa" w:w="70"/>
-            </w:tcMar>
-          </w:tcPr>
-          <w:p>
-            <w:pPr>
-              <w:spacing w:after="0"/>
-            </w:pPr>
-            <w:r>
-              <w:rPr>
-                <w:sz w:val="17"/>
-                <w:szCs w:val="17"/>
-              </w:rPr>
-              <w:t xml:space="preserve">$492 · 61 → 7</w:t>
-            </w:r>
-          </w:p>
-        </w:tc>
-        <w:tc>
-          <w:tcPr>
-            <w:tcW w:type="dxa" w:w="2300"/>
-            <w:shd w:fill="FFFFFF" w:color="auto" w:val="clear"/>
-            <w:tcMar>
-              <w:top w:type="dxa" w:w="40"/>
-              <w:left w:type="dxa" w:w="70"/>
-              <w:bottom w:type="dxa" w:w="40"/>
-              <w:right w:type="dxa" w:w="70"/>
-            </w:tcMar>
-          </w:tcPr>
-          <w:p>
-            <w:pPr>
-              <w:spacing w:after="0"/>
-            </w:pPr>
-            <w:r>
-              <w:rPr>
-                <w:sz w:val="17"/>
-                <w:szCs w:val="17"/>
-              </w:rPr>
-              <w:t xml:space="preserve">$74 · 2 → 1</w:t>
-            </w:r>
-          </w:p>
-        </w:tc>
-        <w:tc>
-          <w:tcPr>
-            <w:tcW w:type="dxa" w:w="1172"/>
-            <w:shd w:fill="FFFFFF" w:color="auto" w:val="clear"/>
-            <w:tcMar>
-              <w:top w:type="dxa" w:w="40"/>
-              <w:left w:type="dxa" w:w="70"/>
-              <w:bottom w:type="dxa" w:w="40"/>
-              <w:right w:type="dxa" w:w="70"/>
-            </w:tcMar>
-          </w:tcPr>
-          <w:p>
-            <w:pPr>
-              <w:spacing w:after="0"/>
-            </w:pPr>
-            <w:r>
-              <w:rPr>
-                <w:sz w:val="17"/>
-                <w:szCs w:val="17"/>
-              </w:rPr>
-              <w:t xml:space="preserve">B4</w:t>
-            </w:r>
-          </w:p>
-        </w:tc>
-      </w:tr>
-      <w:tr>
-        <w:tc>
-          <w:tcPr>
-            <w:tcW w:type="dxa" w:w="3000"/>
-            <w:shd w:fill="F2F5F9" w:color="auto" w:val="clear"/>
-            <w:tcMar>
-              <w:top w:type="dxa" w:w="40"/>
-              <w:left w:type="dxa" w:w="70"/>
-              <w:bottom w:type="dxa" w:w="40"/>
-              <w:right w:type="dxa" w:w="70"/>
-            </w:tcMar>
-          </w:tcPr>
-          <w:p>
-            <w:pPr>
-              <w:spacing w:after="0"/>
-            </w:pPr>
-            <w:r>
-              <w:rPr>
-                <w:sz w:val="17"/>
-                <w:szCs w:val="17"/>
-              </w:rPr>
-              <w:t xml:space="preserve">bamboo sheets king</w:t>
-            </w:r>
-          </w:p>
-        </w:tc>
-        <w:tc>
-          <w:tcPr>
-            <w:tcW w:type="dxa" w:w="1200"/>
-            <w:shd w:fill="F2F5F9" w:color="auto" w:val="clear"/>
-            <w:tcMar>
-              <w:top w:type="dxa" w:w="40"/>
-              <w:left w:type="dxa" w:w="70"/>
-              <w:bottom w:type="dxa" w:w="40"/>
-              <w:right w:type="dxa" w:w="70"/>
-            </w:tcMar>
-          </w:tcPr>
-          <w:p>
-            <w:pPr>
-              <w:spacing w:after="0"/>
-            </w:pPr>
-            <w:r>
-              <w:rPr>
-                <w:sz w:val="17"/>
-                <w:szCs w:val="17"/>
-              </w:rPr>
-              <w:t xml:space="preserve">22 / 26</w:t>
-            </w:r>
-          </w:p>
-        </w:tc>
-        <w:tc>
-          <w:tcPr>
-            <w:tcW w:type="dxa" w:w="2300"/>
-            <w:shd w:fill="F2F5F9" w:color="auto" w:val="clear"/>
-            <w:tcMar>
-              <w:top w:type="dxa" w:w="40"/>
-              <w:left w:type="dxa" w:w="70"/>
-              <w:bottom w:type="dxa" w:w="40"/>
-              <w:right w:type="dxa" w:w="70"/>
-            </w:tcMar>
-          </w:tcPr>
-          <w:p>
-            <w:pPr>
-              <w:spacing w:after="0"/>
-            </w:pPr>
-            <w:r>
-              <w:rPr>
-                <w:sz w:val="17"/>
-                <w:szCs w:val="17"/>
-              </w:rPr>
-              <w:t xml:space="preserve">$458 · 71 → 14</w:t>
-            </w:r>
-          </w:p>
-        </w:tc>
-        <w:tc>
-          <w:tcPr>
-            <w:tcW w:type="dxa" w:w="2300"/>
-            <w:shd w:fill="F2F5F9" w:color="auto" w:val="clear"/>
-            <w:tcMar>
-              <w:top w:type="dxa" w:w="40"/>
-              <w:left w:type="dxa" w:w="70"/>
-              <w:bottom w:type="dxa" w:w="40"/>
-              <w:right w:type="dxa" w:w="70"/>
-            </w:tcMar>
-          </w:tcPr>
-          <w:p>
-            <w:pPr>
-              <w:spacing w:after="0"/>
-            </w:pPr>
-            <w:r>
-              <w:rPr>
-                <w:sz w:val="17"/>
-                <w:szCs w:val="17"/>
-              </w:rPr>
-              <w:t xml:space="preserve">$31 · 6 → 3</w:t>
-            </w:r>
-          </w:p>
-        </w:tc>
-        <w:tc>
-          <w:tcPr>
-            <w:tcW w:type="dxa" w:w="1172"/>
-            <w:shd w:fill="F2F5F9" w:color="auto" w:val="clear"/>
-            <w:tcMar>
-              <w:top w:type="dxa" w:w="40"/>
-              <w:left w:type="dxa" w:w="70"/>
-              <w:bottom w:type="dxa" w:w="40"/>
-              <w:right w:type="dxa" w:w="70"/>
-            </w:tcMar>
-          </w:tcPr>
-          <w:p>
-            <w:pPr>
-              <w:spacing w:after="0"/>
-            </w:pPr>
-            <w:r>
-              <w:rPr>
-                <w:sz w:val="17"/>
-                <w:szCs w:val="17"/>
-              </w:rPr>
-              <w:t xml:space="preserve">B4</w:t>
-            </w:r>
-          </w:p>
-        </w:tc>
-      </w:tr>
-      <w:tr>
-        <w:tc>
-          <w:tcPr>
-            <w:tcW w:type="dxa" w:w="3000"/>
-            <w:shd w:fill="FFFFFF" w:color="auto" w:val="clear"/>
-            <w:tcMar>
-              <w:top w:type="dxa" w:w="40"/>
-              <w:left w:type="dxa" w:w="70"/>
-              <w:bottom w:type="dxa" w:w="40"/>
-              <w:right w:type="dxa" w:w="70"/>
-            </w:tcMar>
-          </w:tcPr>
-          <w:p>
-            <w:pPr>
-              <w:spacing w:after="0"/>
-            </w:pPr>
-            <w:r>
-              <w:rPr>
-                <w:sz w:val="17"/>
-                <w:szCs w:val="17"/>
-              </w:rPr>
-              <w:t xml:space="preserve">bamboo sheets king size</w:t>
-            </w:r>
-          </w:p>
-        </w:tc>
-        <w:tc>
-          <w:tcPr>
-            <w:tcW w:type="dxa" w:w="1200"/>
-            <w:shd w:fill="FFFFFF" w:color="auto" w:val="clear"/>
-            <w:tcMar>
-              <w:top w:type="dxa" w:w="40"/>
-              <w:left w:type="dxa" w:w="70"/>
-              <w:bottom w:type="dxa" w:w="40"/>
-              <w:right w:type="dxa" w:w="70"/>
-            </w:tcMar>
-          </w:tcPr>
-          <w:p>
-            <w:pPr>
-              <w:spacing w:after="0"/>
-            </w:pPr>
-            <w:r>
-              <w:rPr>
-                <w:sz w:val="17"/>
-                <w:szCs w:val="17"/>
-              </w:rPr>
-              <w:t xml:space="preserve">25 / 36</w:t>
-            </w:r>
-          </w:p>
-        </w:tc>
-        <w:tc>
-          <w:tcPr>
-            <w:tcW w:type="dxa" w:w="2300"/>
-            <w:shd w:fill="FFFFFF" w:color="auto" w:val="clear"/>
-            <w:tcMar>
-              <w:top w:type="dxa" w:w="40"/>
-              <w:left w:type="dxa" w:w="70"/>
-              <w:bottom w:type="dxa" w:w="40"/>
-              <w:right w:type="dxa" w:w="70"/>
-            </w:tcMar>
-          </w:tcPr>
-          <w:p>
-            <w:pPr>
-              <w:spacing w:after="0"/>
-            </w:pPr>
-            <w:r>
-              <w:rPr>
-                <w:sz w:val="17"/>
-                <w:szCs w:val="17"/>
-              </w:rPr>
-              <w:t xml:space="preserve">$391 · 38 → 5</w:t>
-            </w:r>
-          </w:p>
-        </w:tc>
-        <w:tc>
-          <w:tcPr>
-            <w:tcW w:type="dxa" w:w="2300"/>
-            <w:shd w:fill="FFFFFF" w:color="auto" w:val="clear"/>
-            <w:tcMar>
-              <w:top w:type="dxa" w:w="40"/>
-              <w:left w:type="dxa" w:w="70"/>
-              <w:bottom w:type="dxa" w:w="40"/>
-              <w:right w:type="dxa" w:w="70"/>
-            </w:tcMar>
-          </w:tcPr>
-          <w:p>
-            <w:pPr>
-              <w:spacing w:after="0"/>
-            </w:pPr>
-            <w:r>
-              <w:rPr>
-                <w:sz w:val="17"/>
-                <w:szCs w:val="17"/>
-              </w:rPr>
-              <w:t xml:space="preserve">$63 · 14 → 6</w:t>
-            </w:r>
-          </w:p>
-        </w:tc>
-        <w:tc>
-          <w:tcPr>
-            <w:tcW w:type="dxa" w:w="1172"/>
-            <w:shd w:fill="FFFFFF" w:color="auto" w:val="clear"/>
-            <w:tcMar>
-              <w:top w:type="dxa" w:w="40"/>
-              <w:left w:type="dxa" w:w="70"/>
-              <w:bottom w:type="dxa" w:w="40"/>
-              <w:right w:type="dxa" w:w="70"/>
-            </w:tcMar>
-          </w:tcPr>
-          <w:p>
-            <w:pPr>
-              <w:spacing w:after="0"/>
-            </w:pPr>
-            <w:r>
-              <w:rPr>
-                <w:sz w:val="17"/>
-                <w:szCs w:val="17"/>
-              </w:rPr>
-              <w:t xml:space="preserve">B6</w:t>
-            </w:r>
-          </w:p>
-        </w:tc>
-      </w:tr>
-      <w:tr>
-        <w:tc>
-          <w:tcPr>
-            <w:tcW w:type="dxa" w:w="3000"/>
-            <w:shd w:fill="F2F5F9" w:color="auto" w:val="clear"/>
-            <w:tcMar>
-              <w:top w:type="dxa" w:w="40"/>
-              <w:left w:type="dxa" w:w="70"/>
-              <w:bottom w:type="dxa" w:w="40"/>
-              <w:right w:type="dxa" w:w="70"/>
-            </w:tcMar>
-          </w:tcPr>
-          <w:p>
-            <w:pPr>
-              <w:spacing w:after="0"/>
-            </w:pPr>
-            <w:r>
-              <w:rPr>
-                <w:sz w:val="17"/>
-                <w:szCs w:val="17"/>
-              </w:rPr>
-              <w:t xml:space="preserve">decolure bamboo sheets</w:t>
-            </w:r>
-          </w:p>
-        </w:tc>
-        <w:tc>
-          <w:tcPr>
-            <w:tcW w:type="dxa" w:w="1200"/>
-            <w:shd w:fill="F2F5F9" w:color="auto" w:val="clear"/>
-            <w:tcMar>
-              <w:top w:type="dxa" w:w="40"/>
-              <w:left w:type="dxa" w:w="70"/>
-              <w:bottom w:type="dxa" w:w="40"/>
-              <w:right w:type="dxa" w:w="70"/>
-            </w:tcMar>
-          </w:tcPr>
-          <w:p>
-            <w:pPr>
-              <w:spacing w:after="0"/>
-            </w:pPr>
-            <w:r>
-              <w:rPr>
-                <w:sz w:val="17"/>
-                <w:szCs w:val="17"/>
-              </w:rPr>
-              <w:t xml:space="preserve">— / —</w:t>
-            </w:r>
-          </w:p>
-        </w:tc>
-        <w:tc>
-          <w:tcPr>
-            <w:tcW w:type="dxa" w:w="2300"/>
-            <w:shd w:fill="F2F5F9" w:color="auto" w:val="clear"/>
-            <w:tcMar>
-              <w:top w:type="dxa" w:w="40"/>
-              <w:left w:type="dxa" w:w="70"/>
-              <w:bottom w:type="dxa" w:w="40"/>
-              <w:right w:type="dxa" w:w="70"/>
-            </w:tcMar>
-          </w:tcPr>
-          <w:p>
-            <w:pPr>
-              <w:spacing w:after="0"/>
-            </w:pPr>
-            <w:r>
-              <w:rPr>
-                <w:sz w:val="17"/>
-                <w:szCs w:val="17"/>
-              </w:rPr>
-              <w:t xml:space="preserve">$150 · 57 → 12</w:t>
-            </w:r>
-          </w:p>
-        </w:tc>
-        <w:tc>
-          <w:tcPr>
-            <w:tcW w:type="dxa" w:w="2300"/>
-            <w:shd w:fill="F2F5F9" w:color="auto" w:val="clear"/>
-            <w:tcMar>
-              <w:top w:type="dxa" w:w="40"/>
-              <w:left w:type="dxa" w:w="70"/>
-              <w:bottom w:type="dxa" w:w="40"/>
-              <w:right w:type="dxa" w:w="70"/>
-            </w:tcMar>
-          </w:tcPr>
-          <w:p>
-            <w:pPr>
-              <w:spacing w:after="0"/>
-            </w:pPr>
-            <w:r>
-              <w:rPr>
-                <w:sz w:val="17"/>
-                <w:szCs w:val="17"/>
-              </w:rPr>
-              <w:t xml:space="preserve">$585 · 84 → 15</w:t>
-            </w:r>
-          </w:p>
-        </w:tc>
-        <w:tc>
-          <w:tcPr>
-            <w:tcW w:type="dxa" w:w="1172"/>
-            <w:shd w:fill="F2F5F9" w:color="auto" w:val="clear"/>
-            <w:tcMar>
-              <w:top w:type="dxa" w:w="40"/>
-              <w:left w:type="dxa" w:w="70"/>
-              <w:bottom w:type="dxa" w:w="40"/>
-              <w:right w:type="dxa" w:w="70"/>
-            </w:tcMar>
-          </w:tcPr>
-          <w:p>
-            <w:pPr>
-              <w:spacing w:after="0"/>
-            </w:pPr>
-            <w:r>
-              <w:rPr>
-                <w:sz w:val="17"/>
-                <w:szCs w:val="17"/>
-              </w:rPr>
-              <w:t xml:space="preserve">B6</w:t>
-            </w:r>
-          </w:p>
-        </w:tc>
-      </w:tr>
-    </w:tbl>
-    <w:p>
-      <w:pPr>
-        <w:spacing w:after="40"/>
-      </w:pPr>
-    </w:p>
-    <w:p>
-      <w:pPr>
-        <w:spacing w:after="100"/>
-      </w:pPr>
-      <w:r>
-        <w:t xml:space="preserve">The product that doesn’t own a term keeps its campaign at break-even and is never raised against the owner; where it adds nothing, pause it. The owner must be named before a term gets a push price. For “bamboo sheets king size” the orders point to B6, so either B6 runs that push or you name B4 as owner.</w:t>
       </w:r>
     </w:p>
     <w:p>
@@ -8228,7 +7236,7 @@
         <w:spacing w:after="60"/>
       </w:pPr>
       <w:r>
-        <w:t xml:space="preserve">By 30 September: agree the goals, decide on “bamboo sheets”, and name owners for the B4/B6 shared terms.</w:t>
+        <w:t xml:space="preserve">By 30 September: agree the goals and decide on “bamboo sheets”.</w:t>
       </w:r>
     </w:p>
     <w:p>
@@ -8380,19 +7388,6 @@
       </w:pPr>
       <w:r>
         <w:t xml:space="preserve">It builds the market price from our own past cost per click.</w:t>
-      </w:r>
-    </w:p>
-    <w:p>
-      <w:pPr>
-        <w:pStyle w:val="ListParagraph"/>
-        <w:numPr>
-          <w:ilvl w:val="0"/>
-          <w:numId w:val="4"/>
-        </w:numPr>
-        <w:spacing w:after="60"/>
-      </w:pPr>
-      <w:r>
-        <w:t xml:space="preserve">It ignores that B4 and B6 bid the same terms.</w:t>
       </w:r>
     </w:p>
     <w:p>

</xml_diff>

<commit_message>
Remove suggested top-of-search bid step from DBS4 corrections
Co-Authored-By: Claude Opus 5.5 <noreply@anthropic.com>
Claude-Session: https://claude.ai/code/session_01LY7A1KPDoE1cQtWdmceR2R
</commit_message>
<xml_diff>
--- a/docs/DBS4_Audit_Corrections_20260928.docx
+++ b/docs/DBS4_Audit_Corrections_20260928.docx
@@ -119,7 +119,7 @@
         <w:t xml:space="preserve">Push the focus terms at top of search now; bring everything else to break-even. </w:t>
       </w:r>
       <w:r>
-        <w:t xml:space="preserve">The rank push can’t wait for the next deal: it has to be built before each event. The push is sized to each term’s rank gap, capped at the market price, and climbs at most 30% per step. The audit’s three 75% jumps go. Every other ranking campaign comes down to break-even, and that saving pays for the push (Section 5).</w:t>
+        <w:t xml:space="preserve">The rank push can’t wait for the next deal: it has to be built before each event. The push is sized to each term’s rank gap and climbs at most 30% per step. The audit’s three 75% jumps go. Every other ranking campaign comes down to break-even, and that saving pays for the push (Section 5).</w:t>
       </w:r>
     </w:p>
     <w:p>
@@ -546,7 +546,7 @@
                 <w:sz w:val="17"/>
                 <w:szCs w:val="17"/>
               </w:rPr>
-              <w:t xml:space="preserve">A price above break-even paid on purpose to buy rank. It is set by how far the term is from its target rank, capped at the market price plus 15%, and it climbs at most 30% per step.</w:t>
+              <w:t xml:space="preserve">A price above break-even paid on purpose to buy rank. It is set by how far the term is from its target rank, and it climbs at most 30% per step.</w:t>
             </w:r>
           </w:p>
         </w:tc>
@@ -572,7 +572,7 @@
                 <w:sz w:val="17"/>
                 <w:szCs w:val="17"/>
               </w:rPr>
-              <w:t xml:space="preserve">Market price</w:t>
+              <w:t xml:space="preserve">Available stock</w:t>
             </w:r>
           </w:p>
         </w:tc>
@@ -596,7 +596,7 @@
                 <w:sz w:val="17"/>
                 <w:szCs w:val="17"/>
               </w:rPr>
-              <w:t xml:space="preserve">What the top slot really costs for a term, measured independently. That means Amazon’s suggested top-of-search bid, never our own past cost per click.</w:t>
+              <w:t xml:space="preserve">Units Amazon can sell today. Units in transfer between warehouses count only toward replenishment, and customer orders never count.</w:t>
             </w:r>
           </w:p>
         </w:tc>
@@ -622,7 +622,7 @@
                 <w:sz w:val="17"/>
                 <w:szCs w:val="17"/>
               </w:rPr>
-              <w:t xml:space="preserve">Available stock</w:t>
+              <w:t xml:space="preserve">Ranking colour / clearance colour</w:t>
             </w:r>
           </w:p>
         </w:tc>
@@ -630,56 +630,6 @@
           <w:tcPr>
             <w:tcW w:type="dxa" w:w="7372"/>
             <w:shd w:fill="FFFFFF" w:color="auto" w:val="clear"/>
-            <w:tcMar>
-              <w:top w:type="dxa" w:w="40"/>
-              <w:left w:type="dxa" w:w="70"/>
-              <w:bottom w:type="dxa" w:w="40"/>
-              <w:right w:type="dxa" w:w="70"/>
-            </w:tcMar>
-          </w:tcPr>
-          <w:p>
-            <w:pPr>
-              <w:spacing w:after="0"/>
-            </w:pPr>
-            <w:r>
-              <w:rPr>
-                <w:sz w:val="17"/>
-                <w:szCs w:val="17"/>
-              </w:rPr>
-              <w:t xml:space="preserve">Units Amazon can sell today. Units in transfer between warehouses count only toward replenishment, and customer orders never count.</w:t>
-            </w:r>
-          </w:p>
-        </w:tc>
-      </w:tr>
-      <w:tr>
-        <w:tc>
-          <w:tcPr>
-            <w:tcW w:type="dxa" w:w="2600"/>
-            <w:shd w:fill="F2F5F9" w:color="auto" w:val="clear"/>
-            <w:tcMar>
-              <w:top w:type="dxa" w:w="40"/>
-              <w:left w:type="dxa" w:w="70"/>
-              <w:bottom w:type="dxa" w:w="40"/>
-              <w:right w:type="dxa" w:w="70"/>
-            </w:tcMar>
-          </w:tcPr>
-          <w:p>
-            <w:pPr>
-              <w:spacing w:after="0"/>
-            </w:pPr>
-            <w:r>
-              <w:rPr>
-                <w:sz w:val="17"/>
-                <w:szCs w:val="17"/>
-              </w:rPr>
-              <w:t xml:space="preserve">Ranking colour / clearance colour</w:t>
-            </w:r>
-          </w:p>
-        </w:tc>
-        <w:tc>
-          <w:tcPr>
-            <w:tcW w:type="dxa" w:w="7372"/>
-            <w:shd w:fill="F2F5F9" w:color="auto" w:val="clear"/>
             <w:tcMar>
               <w:top w:type="dxa" w:w="40"/>
               <w:left w:type="dxa" w:w="70"/>
@@ -1870,7 +1820,7 @@
         <w:t xml:space="preserve">A push price has limits. </w:t>
       </w:r>
       <w:r>
-        <w:t xml:space="preserve">Start from break-even and add a premium for the rank gap: +25% when the current rank is within 1.5× the target, otherwise (current ÷ target − 1) × 50%. Never pay more than the market price + 15%, and never climb more than 30% in one step.</w:t>
+        <w:t xml:space="preserve">Start from break-even and add a premium for the rank gap: +25% when the current rank is within 1.5× the target, otherwise (current ÷ target − 1) × 50%. Never climb more than 30% in one step.</w:t>
       </w:r>
     </w:p>
     <w:p>
@@ -2259,7 +2209,7 @@
         <w:t xml:space="preserve">Start the push on the same day. </w:t>
       </w:r>
       <w:r>
-        <w:t xml:space="preserve">Pull Amazon’s suggested top-of-search bid for each focus term, then write each term’s push price (Section 5). Raise the focus budgets to their required clicks at that price. The focus terms must not see a gap between deal traffic ending and the push starting.</w:t>
+        <w:t xml:space="preserve">Write each focus term’s push price (Section 5). Raise the focus budgets to their required clicks at that price. The focus terms must not see a gap between deal traffic ending and the push starting.</w:t>
       </w:r>
     </w:p>
     <w:p>
@@ -2386,7 +2336,7 @@
         <w:spacing w:after="60"/>
       </w:pPr>
       <w:r>
-        <w:t xml:space="preserve">Give focus terms whose rank moved their next push step (at most +30%, within the market price + 15%). Where rank didn’t move after a week of full delivery, stop the premium and find out why.</w:t>
+        <w:t xml:space="preserve">Give focus terms whose rank moved their next push step (at most +30%). Where rank didn’t move after a week of full delivery, stop the premium and find out why.</w:t>
       </w:r>
     </w:p>
     <w:p>
@@ -2496,7 +2446,7 @@
         <w:spacing w:after="60"/>
       </w:pPr>
       <w:r>
-        <w:t xml:space="preserve">It raises prices on 16 ranking campaigns without applying the push limits. 14 of the raises land above break-even with no market price behind them, and three are 75% jumps in one step (the audit calls them “dose” pushes). Its own notes rate those at about a 20% chance of working, and none of the three keywords has made a sale yet.</w:t>
+        <w:t xml:space="preserve">It raises prices on 16 ranking campaigns without applying the push limits. 14 of the raises land above break-even without being sized to the rank gap, and three are 75% jumps in one step (the audit calls them “dose” pushes). Its own notes rate those at about a 20% chance of working, and none of the three keywords has made a sale yet.</w:t>
       </w:r>
     </w:p>
     <w:p>
@@ -2887,7 +2837,7 @@
                 <w:sz w:val="17"/>
                 <w:szCs w:val="17"/>
               </w:rPr>
-              <w:t xml:space="preserve">Climb up to +30% ($9.89) this step, but only as far as the market price + 15%. Move the ad to Queen Light Blue.</w:t>
+              <w:t xml:space="preserve">Climb +30% to $9.89 this step, then +30% a week while rank moves, up to $14.00. Move the ad to Queen Light Blue.</w:t>
             </w:r>
           </w:p>
         </w:tc>
@@ -3033,7 +2983,7 @@
                 <w:sz w:val="17"/>
                 <w:szCs w:val="17"/>
               </w:rPr>
-              <w:t xml:space="preserve">$6.62 if the market price + 15% allows; otherwise the market cap (Section 6)</w:t>
+              <w:t xml:space="preserve">$6.62 (Section 6)</w:t>
             </w:r>
           </w:p>
         </w:tc>
@@ -3759,7 +3709,7 @@
         <w:t xml:space="preserve">Your decision. </w:t>
       </w:r>
       <w:r>
-        <w:t xml:space="preserve">Whether “bamboo sheets” is a push term into the events. That needs its market price and a budget of about 23 top-of-search clicks a day. If it isn’t a push term, its price steps down to the $2.26 break-even the following week.</w:t>
+        <w:t xml:space="preserve">Whether “bamboo sheets” is a push term into the events. That needs a budget of about 23 top-of-search clicks a day. If it isn’t a push term, its price steps down to the $2.26 break-even the following week.</w:t>
       </w:r>
     </w:p>
     <w:p>
@@ -4298,7 +4248,7 @@
                 <w:sz w:val="17"/>
                 <w:szCs w:val="17"/>
               </w:rPr>
-              <w:t xml:space="preserve">Top of search $6.41 → $6.62, within the market price + 15%. Budget to its required clicks at that price.</w:t>
+              <w:t xml:space="preserve">Top of search $6.41 → $6.62. Budget to its required clicks at that price.</w:t>
             </w:r>
           </w:p>
         </w:tc>
@@ -7249,7 +7199,7 @@
         <w:spacing w:after="60"/>
       </w:pPr>
       <w:r>
-        <w:t xml:space="preserve">29 September (Day 1): bring spend inside the limit, pull market prices for the focus terms, and write the push prices and budgets. Make the colour switches by hand, and switch the non-serving focus campaigns to fixed bidding.</w:t>
+        <w:t xml:space="preserve">29 September (Day 1): bring spend inside the limit, and write the push prices and budgets. Make the colour switches by hand, and switch the non-serving focus campaigns to fixed bidding.</w:t>
       </w:r>
     </w:p>
     <w:p>
@@ -7374,20 +7324,7 @@
         <w:spacing w:after="60"/>
       </w:pPr>
       <w:r>
-        <w:t xml:space="preserve">Its push raises skip the rank-gap size, the market price and the 30% step limit (the “dose” rule), and it pushes terms that fail on conversion or stock.</w:t>
-      </w:r>
-    </w:p>
-    <w:p>
-      <w:pPr>
-        <w:pStyle w:val="ListParagraph"/>
-        <w:numPr>
-          <w:ilvl w:val="0"/>
-          <w:numId w:val="4"/>
-        </w:numPr>
-        <w:spacing w:after="60"/>
-      </w:pPr>
-      <w:r>
-        <w:t xml:space="preserve">It builds the market price from our own past cost per click.</w:t>
+        <w:t xml:space="preserve">Its push raises skip the rank-gap size and the 30% step limit (the “dose” rule), and it pushes terms that fail on conversion or stock.</w:t>
       </w:r>
     </w:p>
     <w:p>

</xml_diff>

<commit_message>
Correct DBS4 corrections after review: King swaps, ranks, push ceiling
Fix King/Creme description, split the two cooling King Size campaigns,
use 28 Sep crawl ranks, cap push at twice break-even, narrow the
objective claim, and name the clearance leak the audit missed.

Co-Authored-By: Claude Opus 5.5 <noreply@anthropic.com>
Claude-Session: https://claude.ai/code/session_01LY7A1KPDoE1cQtWdmceR2R
</commit_message>
<xml_diff>
--- a/docs/DBS4_Audit_Corrections_20260928.docx
+++ b/docs/DBS4_Audit_Corrections_20260928.docx
@@ -119,7 +119,7 @@
         <w:t xml:space="preserve">Push the focus terms at top of search now; bring everything else to break-even. </w:t>
       </w:r>
       <w:r>
-        <w:t xml:space="preserve">The rank push can’t wait for the next deal: it has to be built before each event. The push is sized to each term’s rank gap and climbs at most 30% per step. The audit’s three 75% jumps go. Every other ranking campaign comes down to break-even, and that saving pays for the push (Section 5).</w:t>
+        <w:t xml:space="preserve">The rank push can’t wait for the next deal: it has to be built before each event. The push is sized to each term’s rank gap, never more than twice its break-even, and climbs at most 30% per step. The audit’s three 75% jumps go. Every other ranking campaign comes down to break-even, and that saving pays for the push (Section 5).</w:t>
       </w:r>
     </w:p>
     <w:p>
@@ -396,7 +396,7 @@
                 <w:sz w:val="17"/>
                 <w:szCs w:val="17"/>
               </w:rPr>
-              <w:t xml:space="preserve">The base bid is what we pay on product pages and in the rest of search. The boost is a percentage Amazon adds for the top slots only.</w:t>
+              <w:t xml:space="preserve">The base bid is what we pay on product pages and in the rest of search. The boost (the top-of-search modifier in Campaign Manager) is a percentage Amazon adds for the top slots only.</w:t>
             </w:r>
           </w:p>
         </w:tc>
@@ -446,7 +446,7 @@
                 <w:sz w:val="17"/>
                 <w:szCs w:val="17"/>
               </w:rPr>
-              <w:t xml:space="preserve">Base bid × (1 + boost), which is the most we pay per top-of-search click. The price is the decision; the boost is just the percentage that produces it.</w:t>
+              <w:t xml:space="preserve">Base bid × (1 + boost), which is the most we pay per top-of-search click (the effective top-of-search bid). The price is the decision; the boost is just the percentage that produces it.</w:t>
             </w:r>
           </w:p>
         </w:tc>
@@ -496,7 +496,7 @@
                 <w:sz w:val="17"/>
                 <w:szCs w:val="17"/>
               </w:rPr>
-              <w:t xml:space="preserve">Profit per unit before ads × the chance a click becomes a sale. Above it, each ad sale loses money. Profit per unit comes from Sellerboard: $20.64 for the product and $17.88 for King White (break-even ACoS 27.9%).</w:t>
+              <w:t xml:space="preserve">Profit per unit before ads × the chance a click becomes a sale. Above it, each ad sale loses money. Profit per unit comes from Sellerboard: $20.64 for the product and $17.88 for King White (break-even ACoS 27.9%). The conversion rate is the size’s average until a campaign has 15 clicks, blends toward its own between 15 and 50 clicks, and is its own from 50. Each campaign’s figure is in the campaign register.</w:t>
             </w:r>
           </w:p>
         </w:tc>
@@ -1711,7 +1711,7 @@
         <w:spacing w:after="100"/>
       </w:pPr>
       <w:r>
-        <w:t xml:space="preserve">The deal lifted orders by about a third, but ad spend rose 76% and ACoS went to about 44%. Most of the extra money didn’t buy rank: product pages took as many clicks as top of search, and the top-of-search share never passed 42%. The main term, “bamboo sheets”, spent $4,309 in 13 deal days at 81% ACoS and moved only from 38 to 30.</w:t>
+        <w:t xml:space="preserve">The deal lifted orders by about a third, but ad spend rose 76% and ACoS went to about 44%. Most of the extra money didn’t buy rank: product pages took as many clicks as top of search, and the top-of-search share never passed 42%. The main term, “bamboo sheets”, spent $4,309 in 13 deal days at 81% ACoS and started the deal at 38 and ended it at 36.</w:t>
       </w:r>
     </w:p>
     <w:p>
@@ -1820,7 +1820,7 @@
         <w:t xml:space="preserve">A push price has limits. </w:t>
       </w:r>
       <w:r>
-        <w:t xml:space="preserve">Start from break-even and add a premium for the rank gap: +25% when the current rank is within 1.5× the target, otherwise (current ÷ target − 1) × 50%. Never climb more than 30% in one step.</w:t>
+        <w:t xml:space="preserve">Start from break-even and add a premium for the rank gap: +25% when the current rank is within 1.5× the target, otherwise (current ÷ target − 1) × 50%. Never pay more than twice break-even: that keeps the cost per sale inside the order value. Never climb more than 30% in one step.</w:t>
       </w:r>
     </w:p>
     <w:p>
@@ -2085,7 +2085,7 @@
         <w:spacing w:after="60"/>
       </w:pPr>
       <w:r>
-        <w:t xml:space="preserve">Hold the ground the deal bought: “bamboo sheets” no worse than 30, “bamboo cooling sheets” no worse than 32.</w:t>
+        <w:t xml:space="preserve">Hold the ground the deal bought: “bamboo sheets” no worse than 36 and “bamboo cooling sheets” no worse than 30, today’s ranks.</w:t>
       </w:r>
     </w:p>
     <w:p>
@@ -2098,7 +2098,7 @@
         <w:spacing w:after="60"/>
       </w:pPr>
       <w:r>
-        <w:t xml:space="preserve">Move “bamboo cooling sheets” and the two King White terms up every week toward their targets (5, 8 and 10).</w:t>
+        <w:t xml:space="preserve">Move “bamboo cooling sheets” and the two King White terms (“bamboo sheets king” and “bamboo sheets king size”) up every week toward their targets of 5, 8 and 10.</w:t>
       </w:r>
     </w:p>
     <w:p>
@@ -2472,7 +2472,7 @@
         <w:spacing w:after="60"/>
       </w:pPr>
       <w:r>
-        <w:t xml:space="preserve">It doesn’t push the terms that do qualify. “bamboo cooling sheets” had its raise held for review, and “king sheets bamboo cooling” is left untouched.</w:t>
+        <w:t xml:space="preserve">It raises the price on “bamboo cooling sheets” by about 8%, and its own review held the raise. The review’s reason was that the last raise, on 15 September (boost 340% → 718%), had delivered its traffic without the rank the audit expected. Rank did move, from 36 to 30, so a further step is justified, but only up to the ceiling of twice break-even. That is $8.00, not the uncapped climb the audit is heading for.</w:t>
       </w:r>
     </w:p>
     <w:p>
@@ -2498,7 +2498,7 @@
         <w:spacing w:after="60"/>
       </w:pPr>
       <w:r>
-        <w:t xml:space="preserve">Its notes sometimes contradict the price it writes. On Bamboo Cooling Sheets King Size, the notes say the price is held at the market limit and the keyword is “not pushed”, yet the audit writes a 75% raise to $12.07, about $88 per sale.</w:t>
+        <w:t xml:space="preserve">Its notes sometimes contradict the price it writes. On Bamboo Cooling Sheets King Size [Bamboo|Cooling], the notes say the price is held at the market limit and the keyword is “not pushed”, yet the audit writes a 75% raise to $12.07, about $88 per sale.</w:t>
       </w:r>
     </w:p>
     <w:p>
@@ -2741,7 +2741,7 @@
                 <w:sz w:val="17"/>
                 <w:szCs w:val="17"/>
               </w:rPr>
-              <w:t xml:space="preserve">$4.00 (14.9% own conv.)</w:t>
+              <w:t xml:space="preserve">$4.00</w:t>
             </w:r>
           </w:p>
         </w:tc>
@@ -2789,7 +2789,7 @@
                 <w:sz w:val="17"/>
                 <w:szCs w:val="17"/>
               </w:rPr>
-              <w:t xml:space="preserve">$4.00 × (1 + 2.5) = $14.00</w:t>
+              <w:t xml:space="preserve">$4.00 × 3.5 = $14.00, capped at 2× = $8.00</w:t>
             </w:r>
           </w:p>
         </w:tc>
@@ -2837,7 +2837,7 @@
                 <w:sz w:val="17"/>
                 <w:szCs w:val="17"/>
               </w:rPr>
-              <w:t xml:space="preserve">Climb +30% to $9.89 this step, then +30% a week while rank moves, up to $14.00. Move the ad to Queen Light Blue.</w:t>
+              <w:t xml:space="preserve">$8.00 (+5%). No further climb until rank moves again. Move the ad to Queen Light Blue.</w:t>
             </w:r>
           </w:p>
         </w:tc>
@@ -2911,7 +2911,7 @@
                 <w:sz w:val="17"/>
                 <w:szCs w:val="17"/>
               </w:rPr>
-              <w:t xml:space="preserve">22 → 8</w:t>
+              <w:t xml:space="preserve">20 → 8</w:t>
             </w:r>
           </w:p>
         </w:tc>
@@ -2935,7 +2935,7 @@
                 <w:sz w:val="17"/>
                 <w:szCs w:val="17"/>
               </w:rPr>
-              <w:t xml:space="preserve">$3.53 × 1.875 = $6.62</w:t>
+              <w:t xml:space="preserve">$3.53 × 1.75 = $6.18</w:t>
             </w:r>
           </w:p>
         </w:tc>
@@ -2983,7 +2983,7 @@
                 <w:sz w:val="17"/>
                 <w:szCs w:val="17"/>
               </w:rPr>
-              <w:t xml:space="preserve">$6.62 (Section 6)</w:t>
+              <w:t xml:space="preserve">$6.18 (Section 6)</w:t>
             </w:r>
           </w:p>
         </w:tc>
@@ -3009,7 +3009,7 @@
                 <w:sz w:val="17"/>
                 <w:szCs w:val="17"/>
               </w:rPr>
-              <w:t xml:space="preserve">King Sheets Cooling (focus; meets all four)</w:t>
+              <w:t xml:space="preserve">King Sheets Cooling (focus; too few clicks)</w:t>
             </w:r>
           </w:p>
         </w:tc>
@@ -3057,7 +3057,7 @@
                 <w:sz w:val="17"/>
                 <w:szCs w:val="17"/>
               </w:rPr>
-              <w:t xml:space="preserve">no rank read → 6</w:t>
+              <w:t xml:space="preserve">not tracked → 6</w:t>
             </w:r>
           </w:p>
         </w:tc>
@@ -3081,7 +3081,7 @@
                 <w:sz w:val="17"/>
                 <w:szCs w:val="17"/>
               </w:rPr>
-              <w:t xml:space="preserve">lowest premium: $3.68 × 1.25 = $4.60</w:t>
+              <w:t xml:space="preserve">no push: its live term has 7 clicks</w:t>
             </w:r>
           </w:p>
         </w:tc>
@@ -3129,7 +3129,7 @@
                 <w:sz w:val="17"/>
                 <w:szCs w:val="17"/>
               </w:rPr>
-              <w:t xml:space="preserve">$4.88 now, $4.60 a week later. Get a rank read before paying more.</w:t>
+              <w:t xml:space="preserve">$4.88 now, $3.68 a week later. Add the term to the rank tracker.</w:t>
             </w:r>
           </w:p>
         </w:tc>
@@ -3155,7 +3155,7 @@
                 <w:sz w:val="17"/>
                 <w:szCs w:val="17"/>
               </w:rPr>
-              <w:t xml:space="preserve">Bamboo Cooling Sheets King Size (focus; not serving)</w:t>
+              <w:t xml:space="preserve">Bamboo Cooling Sheets King Size [Bamboo|Cooling] (focus; 7 clicks, 0 orders)</w:t>
             </w:r>
           </w:p>
         </w:tc>
@@ -3227,7 +3227,7 @@
                 <w:sz w:val="17"/>
                 <w:szCs w:val="17"/>
               </w:rPr>
-              <w:t xml:space="preserve">not until it serves</w:t>
+              <w:t xml:space="preserve">no push: too few clicks</w:t>
             </w:r>
           </w:p>
         </w:tc>
@@ -3275,7 +3275,7 @@
                 <w:sz w:val="17"/>
                 <w:szCs w:val="17"/>
               </w:rPr>
-              <w:t xml:space="preserve">Fixed bidding at break-even; push once it serves (Section 8)</w:t>
+              <w:t xml:space="preserve">$3.45 now, $2.60 a week later. See Section 8 for which campaign owns the term.</w:t>
             </w:r>
           </w:p>
         </w:tc>
@@ -3471,7 +3471,7 @@
                 <w:sz w:val="17"/>
                 <w:szCs w:val="17"/>
               </w:rPr>
-              <w:t xml:space="preserve">$1.79 (19.0% own)</w:t>
+              <w:t xml:space="preserve">$1.79</w:t>
             </w:r>
           </w:p>
         </w:tc>
@@ -3585,7 +3585,7 @@
           <w:sz w:val="17"/>
           <w:szCs w:val="17"/>
         </w:rPr>
-        <w:t xml:space="preserve">Premium = (rank now ÷ target − 1) × 50%, or +25% when the ratio is 1.5 or less. The four conditions: clicks above market, conversion above market, stock, serving. “Now · audit” = today’s top-of-search price and what the audit writes.</w:t>
+        <w:t xml:space="preserve">Premium = (rank now ÷ target − 1) × 50%, or +25% when the ratio is 1.5 or less; the push price never exceeds twice break-even. Ranks: our daily organic rank crawl, 28 September. The four conditions: clicks above market, conversion above market, stock, serving. “Now · audit” = today’s top-of-search price and what the audit writes.</w:t>
       </w:r>
     </w:p>
     <w:p>
@@ -3677,7 +3677,7 @@
         <w:spacing w:after="100"/>
       </w:pPr>
       <w:r>
-        <w:t xml:space="preserve">It spends about $319 a day, 29% of all ad spend, and pays $7.42 at top of search against a $2.26 break-even (King White margin × its own 12.7% conversion on 2,448 clicks). The audit leaves it untouched and writes “a human decides” without asking anyone. Even as a push, the price is too high: from rank 30 to a target of 10, the push price is $2.26 × 2 = $4.52.</w:t>
+        <w:t xml:space="preserve">It spends about $319 a day, 29% of all ad spend, and pays $7.42 at top of search against a $2.26 break-even (King White margin × its own 12.7% conversion on 2,448 clicks). The audit leaves it untouched and writes “a human decides” without asking anyone. Even as a push, the price is too high: from rank 36 to a target of 10, the formula gives $5.20, and the twice-break-even ceiling holds it to $4.52.</w:t>
       </w:r>
     </w:p>
     <w:p>
@@ -3694,6 +3694,22 @@
       </w:r>
       <w:r>
         <w:t xml:space="preserve">Step it to $4.52 now (−39%) and keep excluding “bamboo sheets” from the broad and clearance campaigns that take its clicks.</w:t>
+      </w:r>
+    </w:p>
+    <w:p>
+      <w:pPr>
+        <w:spacing w:after="100"/>
+      </w:pPr>
+      <w:r>
+        <w:rPr>
+          <w:b/>
+          <w:bCs/>
+          <w:color w:val="1F3A5F"/>
+        </w:rPr>
+        <w:t xml:space="preserve">This is the riskiest change in the document. </w:t>
+      </w:r>
+      <w:r>
+        <w:t xml:space="preserve">“bamboo sheets” is the term where losing rank costs the most, and its rank swung between 28 and 41 in the deal’s last week. Check its rank every day. If it is worse than 40 on two days running, return the price to $5.90 (half-way back) and find the cause before stepping down again.</w:t>
       </w:r>
     </w:p>
     <w:p>
@@ -3952,7 +3968,7 @@
                 <w:sz w:val="17"/>
                 <w:szCs w:val="17"/>
               </w:rPr>
-              <w:t xml:space="preserve">22 · 8</w:t>
+              <w:t xml:space="preserve">20 · 8</w:t>
             </w:r>
           </w:p>
         </w:tc>
@@ -3976,7 +3992,7 @@
                 <w:sz w:val="17"/>
                 <w:szCs w:val="17"/>
               </w:rPr>
-              <w:t xml:space="preserve">25 · 10</w:t>
+              <w:t xml:space="preserve">35 · 10 (it was 19–20 on 20–21 September)</w:t>
             </w:r>
           </w:p>
         </w:tc>
@@ -4174,7 +4190,7 @@
                 <w:sz w:val="17"/>
                 <w:szCs w:val="17"/>
               </w:rPr>
-              <w:t xml:space="preserve">$3.53 → $6.62</w:t>
+              <w:t xml:space="preserve">$3.53 → $6.18</w:t>
             </w:r>
           </w:p>
         </w:tc>
@@ -4198,7 +4214,7 @@
                 <w:sz w:val="17"/>
                 <w:szCs w:val="17"/>
               </w:rPr>
-              <w:t xml:space="preserve">$2.75 → $4.81</w:t>
+              <w:t xml:space="preserve">$2.75 → $5.50 (the formula gives $6.19; twice break-even caps it)</w:t>
             </w:r>
           </w:p>
         </w:tc>
@@ -4248,7 +4264,7 @@
                 <w:sz w:val="17"/>
                 <w:szCs w:val="17"/>
               </w:rPr>
-              <w:t xml:space="preserve">Top of search $6.41 → $6.62. Budget to its required clicks at that price.</w:t>
+              <w:t xml:space="preserve">Top of search $6.41 → $6.18. Budget to its required clicks at that price.</w:t>
             </w:r>
           </w:p>
         </w:tc>
@@ -4272,7 +4288,7 @@
                 <w:sz w:val="17"/>
                 <w:szCs w:val="17"/>
               </w:rPr>
-              <w:t xml:space="preserve">Fix the mix first: base $1.60 → $1.20 and top of search at $2.75. Move to the $4.81 push price once 70% of clicks are at top of search for 7 days.</w:t>
+              <w:t xml:space="preserve">Fix the mix first: base $1.60 → $1.20 and top of search at $2.75. Its fall from 19–20 to 35 this week has a visible cause: only 7% of its clicks were at top of search in the last 14 days. Move to the $5.50 push price once 70% of clicks are at top of search for 7 days.</w:t>
             </w:r>
           </w:p>
         </w:tc>
@@ -4444,7 +4460,7 @@
         <w:spacing w:after="100"/>
       </w:pPr>
       <w:r>
-        <w:t xml:space="preserve">Stock: the engine flags 26 King campaigns as sitting on a colour that is running out, and moves them to Creme. King White has 29 days Available, with the arrival landing before it runs out. Even on the engine’s own count (228 units, 24 days) it is over the 7-day line. Override the flag and keep King on White.</w:t>
+        <w:t xml:space="preserve">Stock: the engine reads King stock on Creme, as if King White were running out, and its own check fails because 26 King campaigns stay on White with no swap written. It writes no King swap at all, but renames 17 campaigns “KING-CREME” anyway. King White is not running out, and the push leaves room. At today’s pace (about 7 units a day), the 18 days to the 16 October arrival use about 130 of the 298 Available units. The two pushed terms sold about 19 units in 30 days, so even doubling them adds only about 11 units. Keep King on White, override the flag, and undo the renames.</w:t>
       </w:r>
     </w:p>
     <w:p>
@@ -4663,7 +4679,7 @@
                 <w:sz w:val="17"/>
                 <w:szCs w:val="17"/>
               </w:rPr>
-              <w:t xml:space="preserve">Creme (26 campaigns)</w:t>
+              <w:t xml:space="preserve">no swap written, but 17 campaigns renamed “KING-CREME” and stock read on Creme</w:t>
             </w:r>
           </w:p>
         </w:tc>
@@ -5242,7 +5258,7 @@
         <w:spacing w:after="60"/>
       </w:pPr>
       <w:r>
-        <w:t xml:space="preserve">Bamboo Cooling Sheets King Size: 238 clicks and 29 orders in 90 days.</w:t>
+        <w:t xml:space="preserve">Bamboo Cooling Sheets King Size (the older campaign, without [Bamboo|Cooling] in its name): 238 clicks and 29 orders in 90 days.</w:t>
       </w:r>
     </w:p>
     <w:p>
@@ -5276,23 +5292,55 @@
         <w:spacing w:after="100"/>
       </w:pPr>
       <w:r>
-        <w:t xml:space="preserve">The audit raises their price, and on one it cuts the base bid, which makes a quiet campaign quieter. It also predicts one will jump from 0 to 32 top-of-search clicks a week on a $9.94 budget. All three use down-only bidding.</w:t>
-      </w:r>
-    </w:p>
-    <w:p>
-      <w:pPr>
-        <w:spacing w:after="100"/>
+        <w:t xml:space="preserve">The audit raises their price, and on one it cuts the base bid, which makes a quiet campaign quieter. It also predicts one will jump from 0 to 32 top-of-search clicks a week on a $9.94 budget. They are quiet for different reasons:</w:t>
+      </w:r>
+    </w:p>
+    <w:p>
+      <w:pPr>
+        <w:pStyle w:val="ListParagraph"/>
+        <w:numPr>
+          <w:ilvl w:val="0"/>
+          <w:numId w:val="4"/>
+        </w:numPr>
+        <w:spacing w:after="60"/>
       </w:pPr>
       <w:r>
         <w:rPr>
           <w:b/>
           <w:bCs/>
-          <w:color w:val="1F3A5F"/>
         </w:rPr>
-        <w:t xml:space="preserve">Correction. </w:t>
-      </w:r>
-      <w:r>
-        <w:t xml:space="preserve">Keep the base bid and check that each ad is live and on the right colour. Switch to fixed bidding at the break-even price so Amazon can’t hold the price down. Drop their forecasts and budget increases: a campaign that spends nothing is not short of budget. Once a campaign serves, it gets its push step like any other focus term.</w:t>
+        <w:t xml:space="preserve">Bamboo Cooling Sheets King Size has its main keyword switched off. </w:t>
+      </w:r>
+      <w:r>
+        <w:t xml:space="preserve">“bamboo cooling sheets king size” is paused, and its only live keyword has no clicks, so no bid change can make it serve. The same term runs in a newer campaign ([Bamboo|Cooling]) that has 7 clicks and no orders. Correction: re-enable the keyword in the campaign with the 29-order record, at break-even, and pause it in the newer one, so the term has one owner.</w:t>
+      </w:r>
+    </w:p>
+    <w:p>
+      <w:pPr>
+        <w:pStyle w:val="ListParagraph"/>
+        <w:numPr>
+          <w:ilvl w:val="0"/>
+          <w:numId w:val="4"/>
+        </w:numPr>
+        <w:spacing w:after="60"/>
+      </w:pPr>
+      <w:r>
+        <w:rPr>
+          <w:b/>
+          <w:bCs/>
+        </w:rPr>
+        <w:t xml:space="preserve">The other two have live keywords but no clicks, and both use down-only bidding. </w:t>
+      </w:r>
+      <w:r>
+        <w:t xml:space="preserve">Correction: keep the base bid and check each ad is live and on the right colour. Switch to fixed bidding at the break-even price so Amazon can’t hold the price down.</w:t>
+      </w:r>
+    </w:p>
+    <w:p>
+      <w:pPr>
+        <w:spacing w:after="100"/>
+      </w:pPr>
+      <w:r>
+        <w:t xml:space="preserve">For all three, drop the forecasts and budget increases: a campaign that spends nothing is not short of budget. Once a campaign serves, it gets its push step like any other focus term.</w:t>
       </w:r>
     </w:p>
     <w:p>
@@ -5985,7 +6033,7 @@
         <w:spacing w:after="100"/>
       </w:pPr>
       <w:r>
-        <w:t xml:space="preserve">The objective follows the targeting: exact = ranking, auto/broad/phrase = discovery (clearance campaigns keep their own), product targeting = conversions, and the brand term = defensive. The objective decides how a campaign is priced and judged. The audit gets it wrong in four ways:</w:t>
+        <w:t xml:space="preserve">The objective follows the targeting: exact generic terms = ranking, exact competitor-brand and colour terms = conversions, auto/broad/phrase = discovery (clearance campaigns keep their own), product targeting = conversions, and the brand term = defensive. The objective decides how a campaign is priced and judged. The audit gets it wrong in four ways:</w:t>
       </w:r>
     </w:p>
     <w:p>
@@ -5998,7 +6046,7 @@
         <w:spacing w:after="60"/>
       </w:pPr>
       <w:r>
-        <w:t xml:space="preserve">53 exact campaigns are tagged “conversions” and should be ranking; 18 of them are even named “(Ranking)”. The audit adds 19 more such tags.</w:t>
+        <w:t xml:space="preserve">53 exact campaigns are tagged “conversions”. About 20 of them are right as they are: competitor brands (Malouf, Cozy House, Bedlifes, Bella, Doz, Tafts, Pure Bamboo), colour terms (Army Green, Moss Green, Olive Green, Taupe), Spanish-language terms and terms with no search volume. Nobody builds organic rank on another brand’s name. The other 33 are generic bamboo sheet terms and should be ranking, for example Cooling Bamboo Sheets King Size, Deep Pocket Bamboo Sheets King and Bamboo Viscose Sheets King; 13 of them are even named “(Ranking)”. The audit adds 19 more conversions tags, and each should be checked the same way.</w:t>
       </w:r>
     </w:p>
     <w:p>
@@ -6053,7 +6101,15 @@
         <w:spacing w:after="100"/>
       </w:pPr>
       <w:r>
-        <w:t xml:space="preserve">A ranking term earns rank credit only through the exact campaign that owns it. 26 ranking terms are also bought by broad or auto campaigns. The largest is a clearance broad campaign (advertising B4 Queen Olive). In 30 days it took 164 clicks on “bamboo sheets” ($409), plus clicks on most of the other ranking terms. Separately, 14 campaigns share an exact term with another active exact campaign.</w:t>
+        <w:t xml:space="preserve">A ranking term earns rank credit only through the exact campaign that owns it. 26 ranking terms are also bought by broad or auto campaigns. The largest is the clearance broad campaign DBS6-SP-LTSF-ALL (advertising B4 Queen Olive). In 30 days it took 164 clicks on “bamboo sheets” ($409), plus clicks on most of the other ranking terms. Separately, 14 campaigns share an exact term with another active exact campaign.</w:t>
+      </w:r>
+    </w:p>
+    <w:p>
+      <w:pPr>
+        <w:spacing w:after="100"/>
+      </w:pPr>
+      <w:r>
+        <w:t xml:space="preserve">The audit misses this leak. Its exclusion change on DBS6-SP-LTSF-ALL adds four terms worth about $0.78 a week, and neither “bamboo sheets” nor “bamboo sheets king” is among them. The biggest leak on the product is left open.</w:t>
       </w:r>
     </w:p>
     <w:p>
@@ -6069,7 +6125,7 @@
         <w:t xml:space="preserve">Correction. </w:t>
       </w:r>
       <w:r>
-        <w:t xml:space="preserve">Exclude every ranking term (negative exact) from the broad, auto and phrase campaigns that buy it, starting with the clearance broad. Keep one exact owner per term: the campaign on the ranking colour with the clicks. Pause the duplicate. Check that the audit’s exclusion changes on the three clearance campaigns add the ranking terms rather than remove them, and send those three to the clearance owner.</w:t>
+        <w:t xml:space="preserve">Exclude every ranking term (negative exact) from the broad, auto and phrase campaigns that buy it, starting with the clearance broad. Keep one exact owner per term: the campaign on the ranking colour with the clicks. Pause the duplicate. Add “bamboo sheets” and “bamboo sheets king” to DBS6-SP-LTSF-ALL first. Check that the audit’s exclusion changes on the three clearance campaigns add the ranking terms rather than remove them, and send those three to the clearance owner.</w:t>
       </w:r>
     </w:p>
     <w:p>
@@ -7026,6 +7082,19 @@
     </w:p>
     <w:p>
       <w:pPr>
+        <w:pStyle w:val="ListParagraph"/>
+        <w:numPr>
+          <w:ilvl w:val="0"/>
+          <w:numId w:val="4"/>
+        </w:numPr>
+        <w:spacing w:after="60"/>
+      </w:pPr>
+      <w:r>
+        <w:t xml:space="preserve">“bamboo sheets king size” (19 → 35 in a week): only 7% of its clicks in the last 14 days were at top of search. Fix the mix before any push (Section 6).</w:t>
+      </w:r>
+    </w:p>
+    <w:p>
+      <w:pPr>
         <w:spacing w:after="100"/>
       </w:pPr>
       <w:r>
@@ -7157,7 +7226,7 @@
         <w:t xml:space="preserve">The engine’s two failed checks: </w:t>
       </w:r>
       <w:r>
-        <w:t xml:space="preserve">its “running-out” flag on 26 King campaigns is wrong (Section 6), and the video test beside a brand test on the same keyword group should be held.</w:t>
+        <w:t xml:space="preserve">the King check fails because 26 King campaigns stay on White with no swap to Creme, and White is the right colour (Section 6); and the video test beside a brand test on the same keyword group should be held.</w:t>
       </w:r>
     </w:p>
     <w:p>
@@ -7199,7 +7268,7 @@
         <w:spacing w:after="60"/>
       </w:pPr>
       <w:r>
-        <w:t xml:space="preserve">29 September (Day 1): bring spend inside the limit, and write the push prices and budgets. Make the colour switches by hand, and switch the non-serving focus campaigns to fixed bidding.</w:t>
+        <w:t xml:space="preserve">29 September (Day 1): bring spend inside the limit, and write the push prices and budgets. Make the colour switches by hand. Re-enable “bamboo cooling sheets king size” in its original campaign, and switch the other non-serving focus campaigns to fixed bidding. Check “bamboo sheets” rank daily.</w:t>
       </w:r>
     </w:p>
     <w:p>

</xml_diff>